<commit_message>
Update 11 files: 404.html, index.html, index.html, Mahmoud Salama - Executive Technology Portfolio.docx, Mahmoud Salama - Executive Technology Portfolio.pdf, PATCH_NOTES.txt, portfolio.html, resume.html, robots.txt, sitemap.xml, ...omitted 1 file(s)
</commit_message>
<xml_diff>
--- a/Mahmoud Salama - Executive Technology Portfolio.docx
+++ b/Mahmoud Salama - Executive Technology Portfolio.docx
@@ -1169,7 +1169,7 @@
                 <w:color w:val="0B6B72"/>
                 <w:sz w:val="19"/>
               </w:rPr>
-              <w:t>Development Team Leader &amp; Senior Full-Stack Developer — Government Solutions</w:t>
+              <w:t>Senior Full-Stack Developer — Government Solutions</w:t>
             </w:r>
           </w:p>
           <w:p>
@@ -2504,7 +2504,7 @@
         <w:spacing w:after="200"/>
       </w:pPr>
       <w:r>
-        <w:t>Development Team Leader &amp; Senior Full-Stack Developer — Government Solutions. Team leadership continued throughout the period while Mahmoud remained a hands-on contributor.</w:t>
+        <w:t>Senior Full-Stack Developer — Government Solutions. Mahmoud remained a hands-on technical contributor across government client assignments throughout the period.</w:t>
       </w:r>
     </w:p>
     <w:tbl>

</xml_diff>